<commit_message>
Single-source C48 spec and package upstream revision
</commit_message>
<xml_diff>
--- a/docs/ZX-UX C48 SDK User Manual.docx
+++ b/docs/ZX-UX C48 SDK User Manual.docx
@@ -195,7 +195,7 @@
             <w:u w:val="single"/>
             <w:rFonts w:ascii="Aptos" w:hAnsi="Aptos"/>
           </w:rPr>
-          <w:t>C48 Language Specification Rev 0.11.docx</w:t>
+          <w:t>04-C48 Language Specification Rev 0.11.docx (canonical upstream; revisioned 04-* filename may change)</w:t>
         </w:r>
       </w:hyperlink>
       <w:r>
@@ -2228,7 +2228,7 @@
             <w:u w:val="single"/>
             <w:rFonts w:ascii="Aptos" w:hAnsi="Aptos"/>
           </w:rPr>
-          <w:t>C48 Language Specification Rev 0.11.docx</w:t>
+          <w:t>04-C48 Language Specification Rev 0.11.docx (canonical upstream; revisioned 04-* filename may change)</w:t>
         </w:r>
       </w:hyperlink>
       <w:r>

</xml_diff>

<commit_message>
Clarify User Manual native pipeline
</commit_message>
<xml_diff>
--- a/docs/ZX-UX C48 SDK User Manual.docx
+++ b/docs/ZX-UX C48 SDK User Manual.docx
@@ -7581,6 +7581,14 @@
       </w:pPr>
       <w:r>
         <w:t>6.7 Native executable tape cross-development</w:t>
+      </w:r>
+    </w:p>
+    <w:p>
+      <w:pPr>
+        <w:pStyle w:val="BodyText"/>
+      </w:pPr>
+      <w:r>
+        <w:t>The end-to-end host cross-development pipeline is: C source -&gt; c48 -&gt; validated C48B1 -&gt; c48b2tap -&gt; native ZX-UX artifacts. c48 produces the validated C48B1 host representation; c48b2tap then emits relocatable native Z80 OBJ1, linked native ZX-UX MEX1 executable images, or Spectrum .tap images containing the complete MEX1 as an M48O version-1 RAW BIN object suitable for loading into ZX-UX.</w:t>
       </w:r>
     </w:p>
     <w:p>

</xml_diff>